<commit_message>
Document remaining participant collection plan for target N of 96
</commit_message>
<xml_diff>
--- a/analysis_outputs/participant_exclusion_summary_20261021/dynamic_reliability_reviewed_exclusions.docx
+++ b/analysis_outputs/participant_exclusion_summary_20261021/dynamic_reliability_reviewed_exclusions.docx
@@ -632,6 +632,34 @@
         <w:pStyle w:val="Heading2"/>
       </w:pPr>
       <w:r>
+        <w:t>Remaining participant IDs to collect</w:t>
+      </w:r>
+    </w:p>
+    <w:p>
+      <w:r>
+        <w:t>The target is 96 retained participants. With 82 currently retained, 14 further participants are required: seven replacements for exclusions and seven new participants, assuming all pass QC.</w:t>
+      </w:r>
+    </w:p>
+    <w:p>
+      <w:r>
+        <w:t>Re-collect: 023, 049, 051, 065, 075, 079, 081.</w:t>
+        <w:br/>
+        <w:t>New participants: 090, 091, 092, 093, 094, 095, 096.</w:t>
+      </w:r>
+    </w:p>
+    <w:p>
+      <w:pPr>
+        <w:pStyle w:val="SourceNote"/>
+      </w:pPr>
+      <w:r>
+        <w:t>Collection target and replacement plan confirmed by the researcher on 21 October 2026. These IDs are outstanding collection slots, not completed replacement runs.</w:t>
+      </w:r>
+    </w:p>
+    <w:p>
+      <w:pPr>
+        <w:pStyle w:val="Heading2"/>
+      </w:pPr>
+      <w:r>
         <w:t>Reading the diagnostic plots</w:t>
       </w:r>
     </w:p>

</xml_diff>